<commit_message>
submit: unify test count 128 in 01/02; 04 safety report v1
</commit_message>
<xml_diff>
--- a/submit/01_技术文档_v1.docx
+++ b/submit/01_技术文档_v1.docx
@@ -1108,7 +1108,7 @@
                 <w:b w:val="0"/>
                 <w:sz w:val="19"/>
               </w:rPr>
-              <w:t>pytest，当前 83 passed</w:t>
+              <w:t>pytest，当前 128 passed</w:t>
             </w:r>
           </w:p>
         </w:tc>
@@ -2598,7 +2598,7 @@
           <w:b w:val="0"/>
           <w:sz w:val="21"/>
         </w:rPr>
-        <w:t>单测：pytest -q → 83 passed（含 gates / inject / bank_second_gate / amount_parse 等）。</w:t>
+        <w:t>单测：pytest -q → 128 passed（含 gates / inject / bank_second_gate / amount_parse 等）。</w:t>
       </w:r>
     </w:p>
     <w:p>

</xml_diff>